<commit_message>
CV and cert added to the folder
</commit_message>
<xml_diff>
--- a/Joanna_Sorichta_CV.docx
+++ b/Joanna_Sorichta_CV.docx
@@ -22,7 +22,10 @@
         <w:t xml:space="preserve">London, </w:t>
       </w:r>
       <w:r>
-        <w:t xml:space="preserve">SW18, </w:t>
+        <w:t>RM13</w:t>
+      </w:r>
+      <w:r>
+        <w:t xml:space="preserve">, </w:t>
       </w:r>
       <w:r>
         <w:t>United Kingdom</w:t>
@@ -169,7 +172,25 @@
           <w:iCs/>
         </w:rPr>
         <w:br/>
-        <w:t>Oct 2023 – Present</w:t>
+        <w:t xml:space="preserve">Oct 2023 – </w:t>
+      </w:r>
+      <w:r>
+        <w:rPr>
+          <w:b/>
+          <w:bCs/>
+          <w:i/>
+          <w:iCs/>
+        </w:rPr>
+        <w:t>August</w:t>
+      </w:r>
+      <w:r>
+        <w:rPr>
+          <w:b/>
+          <w:bCs/>
+          <w:i/>
+          <w:iCs/>
+        </w:rPr>
+        <w:t xml:space="preserve"> 2026</w:t>
       </w:r>
     </w:p>
     <w:p>

</xml_diff>